<commit_message>
Rewrite the Survey Matrices report to revision 2 and add status notes to the two older reports
Survey_Matrices_Car_Bus_Rail_Report.docx now describes the current method and
numbers: the segmented coverage rule and its asymmetry, taxi-type as a separate
layer, the four 2022 layers, the superzone conservation test of the hybrid, the
corridor profiles as three-hour potential movements, and the corrected Nazareth
diagnosis. Nofit_LRT_OD_Demand_Report.docx and
Demographic_Scenario_Comparison_Report.docx get a dated status note at the front
saying which parts are overtaken and where the current work is; the OD report's
PDF is the 8 September rendering (LibreOffice cannot convert files in this
environment). README lists the reports and their status.

Co-Authored-By: Claude Fable 5.1 <noreply@anthropic.com>
Claude-Session: https://claude.ai/code/session_01ARu29NbW8AYpZqV8kqXTdF
</commit_message>
<xml_diff>
--- a/Demographic_Scenario_Comparison_Report.docx
+++ b/Demographic_Scenario_Comparison_Report.docx
@@ -44,6 +44,31 @@
           <w:szCs w:val="20"/>
         </w:rPr>
         <w:t xml:space="preserve">September 2026 · analysis notebook: Demographic_scenario_comparison.ipynb</w:t>
+      </w:r>
+    </w:p>
+    <w:p>
+      <w:pPr>
+        <w:pBdr>
+          <w:top w:val="single" w:sz="6" w:space="4" w:color="E0B15A"/>
+          <w:left w:val="single" w:sz="6" w:space="4" w:color="E0B15A"/>
+          <w:bottom w:val="single" w:sz="6" w:space="4" w:color="E0B15A"/>
+          <w:right w:val="single" w:sz="6" w:space="4" w:color="E0B15A"/>
+        </w:pBdr>
+        <w:shd w:val="clear" w:color="auto" w:fill="FFF4DB"/>
+        <w:spacing w:after="240"/>
+      </w:pPr>
+      <w:r>
+        <w:rPr>
+          <w:b/>
+          <w:sz w:val="21"/>
+        </w:rPr>
+        <w:t xml:space="preserve">Status note, 21 September 2026. </w:t>
+      </w:r>
+      <w:r>
+        <w:rPr>
+          <w:sz w:val="21"/>
+        </w:rPr>
+        <w:t>The comparison of the BU and HS demographic scenarios in this report stands, and so does its conclusion that each scenario needs its own matrix. Two qualifications apply. First, the four forecast matrices built from it (Forecast_matrices_2040_2050.ipynb and the no-build and LRT-market tables downstream) rest on the historical 25-area composite of Vintage_alignment_2022.ipynb, not on the current survey-only base; they are a demographic reference until rebuilt (task D0 in CORRIDOR_DEMAND_TASKS.md). Second, the "if and only if the per-area margins differ" criterion holds only within the fixed-seed Furness procedure: the scenarios also differ in total growth (HS places 8.8 % more residents and 6.7 % more jobs in the study area by 2050), Furness preserves the 155 empty cells of the base, and identical area totals can still put homes and jobs at different distances from stations. See METHODOLOGY.md section 0 and caveat 10.</w:t>
       </w:r>
     </w:p>
     <w:p>

</xml_diff>